<commit_message>
Cambios a procesamiento de texto y limitacion de entrada
</commit_message>
<xml_diff>
--- a/Documentacion_Resumidor_Pro.docx
+++ b/Documentacion_Resumidor_Pro.docx
@@ -1,6 +1,6 @@
 
 <file path=word/document.xml><?xml version="1.0" encoding="utf-8"?>
-<w:document xmlns:wpc="http://schemas.microsoft.com/office/word/2010/wordprocessingCanvas" xmlns:cx="http://schemas.microsoft.com/office/drawing/2014/chartex" xmlns:cx1="http://schemas.microsoft.com/office/drawing/2015/9/8/chartex" xmlns:cx2="http://schemas.microsoft.com/office/drawing/2015/10/21/chartex" xmlns:cx3="http://schemas.microsoft.com/office/drawing/2016/5/9/chartex" xmlns:cx4="http://schemas.microsoft.com/office/drawing/2016/5/10/chartex" xmlns:cx5="http://schemas.microsoft.com/office/drawing/2016/5/11/chartex" xmlns:cx6="http://schemas.microsoft.com/office/drawing/2016/5/12/chartex" xmlns:cx7="http://schemas.microsoft.com/office/drawing/2016/5/13/chartex" xmlns:cx8="http://schemas.microsoft.com/office/drawing/2016/5/14/chartex" xmlns:mc="http://schemas.openxmlformats.org/markup-compatibility/2006" xmlns:aink="http://schemas.microsoft.com/office/drawing/2016/ink" xmlns:am3d="http://schemas.microsoft.com/office/drawing/2017/model3d" xmlns:o="urn:schemas-microsoft-com:office:office" xmlns:oel="http://schemas.microsoft.com/office/2019/extlst" xmlns:r="http://schemas.openxmlformats.org/officeDocument/2006/relationships" xmlns:m="http://schemas.openxmlformats.org/officeDocument/2006/math" xmlns:v="urn:schemas-microsoft-com:vml" xmlns:wp14="http://schemas.microsoft.com/office/word/2010/wordprocessingDrawing" xmlns:wp="http://schemas.openxmlformats.org/drawingml/2006/wordprocessingDrawing" xmlns:w10="urn:schemas-microsoft-com:office:word" xmlns:w="http://schemas.openxmlformats.org/wordprocessingml/2006/main" xmlns:w14="http://schemas.microsoft.com/office/word/2010/wordml" xmlns:w15="http://schemas.microsoft.com/office/word/2012/wordml" xmlns:w16cex="http://schemas.microsoft.com/office/word/2018/wordml/cex" xmlns:w16cid="http://schemas.microsoft.com/office/word/2016/wordml/cid" xmlns:w16="http://schemas.microsoft.com/office/word/2018/wordml" xmlns:w16du="http://schemas.microsoft.com/office/word/2023/wordml/word16du" xmlns:w16sdtdh="http://schemas.microsoft.com/office/word/2020/wordml/sdtdatahash" xmlns:w16sdtfl="http://schemas.microsoft.com/office/word/2024/wordml/sdtformatlock" xmlns:w16se="http://schemas.microsoft.com/office/word/2015/wordml/symex" xmlns:wpg="http://schemas.microsoft.com/office/word/2010/wordprocessingGroup" xmlns:wpi="http://schemas.microsoft.com/office/word/2010/wordprocessingInk" xmlns:wne="http://schemas.microsoft.com/office/word/2006/wordml" xmlns:wps="http://schemas.microsoft.com/office/word/2010/wordprocessingShape" mc:Ignorable="w14 w15 w16se w16cid w16 w16cex w16sdtdh w16sdtfl w16du wp14">
+<w:document xmlns:wpc="http://schemas.microsoft.com/office/word/2010/wordprocessingCanvas" xmlns:cx="http://schemas.microsoft.com/office/drawing/2014/chartex" xmlns:cx1="http://schemas.microsoft.com/office/drawing/2015/9/8/chartex" xmlns:cx2="http://schemas.microsoft.com/office/drawing/2015/10/21/chartex" xmlns:cx3="http://schemas.microsoft.com/office/drawing/2016/5/9/chartex" xmlns:cx4="http://schemas.microsoft.com/office/drawing/2016/5/10/chartex" xmlns:cx5="http://schemas.microsoft.com/office/drawing/2016/5/11/chartex" xmlns:cx6="http://schemas.microsoft.com/office/drawing/2016/5/12/chartex" xmlns:cx7="http://schemas.microsoft.com/office/drawing/2016/5/13/chartex" xmlns:cx8="http://schemas.microsoft.com/office/drawing/2016/5/14/chartex" xmlns:mc="http://schemas.openxmlformats.org/markup-compatibility/2006" xmlns:aink="http://schemas.microsoft.com/office/drawing/2016/ink" xmlns:am3d="http://schemas.microsoft.com/office/drawing/2017/model3d" xmlns:o="urn:schemas-microsoft-com:office:office" xmlns:r="http://schemas.openxmlformats.org/officeDocument/2006/relationships" xmlns:m="http://schemas.openxmlformats.org/officeDocument/2006/math" xmlns:v="urn:schemas-microsoft-com:vml" xmlns:wp14="http://schemas.microsoft.com/office/word/2010/wordprocessingDrawing" xmlns:wp="http://schemas.openxmlformats.org/drawingml/2006/wordprocessingDrawing" xmlns:w10="urn:schemas-microsoft-com:office:word" xmlns:w="http://schemas.openxmlformats.org/wordprocessingml/2006/main" xmlns:w14="http://schemas.microsoft.com/office/word/2010/wordml" xmlns:w15="http://schemas.microsoft.com/office/word/2012/wordml" xmlns:w16cid="http://schemas.microsoft.com/office/word/2016/wordml/cid" xmlns:w16se="http://schemas.microsoft.com/office/word/2015/wordml/symex" xmlns:wpg="http://schemas.microsoft.com/office/word/2010/wordprocessingGroup" xmlns:wpi="http://schemas.microsoft.com/office/word/2010/wordprocessingInk" xmlns:wne="http://schemas.microsoft.com/office/word/2006/wordml" xmlns:wps="http://schemas.microsoft.com/office/word/2010/wordprocessingShape" mc:Ignorable="w14 w15 w16se w16cid wp14">
   <w:body>
     <w:p/>
     <w:p>
@@ -150,7 +150,14 @@
           <w:rFonts w:ascii="Calibri" w:hAnsi="Calibri"/>
           <w:lang w:val="es-ES"/>
         </w:rPr>
-        <w:t xml:space="preserve"> es una aplicación web de inteligencia artificial que permite generar resúmenes automáticos de textos en español. Funciona completamente en local, sin necesidad de conexión a internet ni envío de datos a servidores externos, garantizando la privacidad total de la información procesada.</w:t>
+        <w:t xml:space="preserve"> es una aplicación web de inteligencia artificial que permite generar resúmenes automáticos de textos en español. Funciona completamente en local, sin necesidad de conexión a internet ni envío de datos a servidores externos, garantizando la privacidad tota</w:t>
+      </w:r>
+      <w:r>
+        <w:rPr>
+          <w:rFonts w:ascii="Calibri" w:hAnsi="Calibri"/>
+          <w:lang w:val="es-ES"/>
+        </w:rPr>
+        <w:t>l de la información procesada.</w:t>
       </w:r>
     </w:p>
     <w:p>
@@ -244,7 +251,14 @@
           <w:rFonts w:ascii="Calibri" w:hAnsi="Calibri"/>
           <w:lang w:val="es-ES"/>
         </w:rPr>
-        <w:t>El usuario pega texto en la interfaz web (</w:t>
+        <w:t>El usuario pega texto en la inter</w:t>
+      </w:r>
+      <w:r>
+        <w:rPr>
+          <w:rFonts w:ascii="Calibri" w:hAnsi="Calibri"/>
+          <w:lang w:val="es-ES"/>
+        </w:rPr>
+        <w:t>faz web (</w:t>
       </w:r>
       <w:proofErr w:type="spellStart"/>
       <w:r>
@@ -294,21 +308,7 @@
         <w:rPr>
           <w:rFonts w:ascii="Calibri" w:hAnsi="Calibri"/>
         </w:rPr>
-        <w:t xml:space="preserve"> </w:t>
-      </w:r>
-      <w:proofErr w:type="spellStart"/>
-      <w:r>
-        <w:rPr>
-          <w:rFonts w:ascii="Calibri" w:hAnsi="Calibri"/>
-        </w:rPr>
-        <w:t>el</w:t>
-      </w:r>
-      <w:proofErr w:type="spellEnd"/>
-      <w:r>
-        <w:rPr>
-          <w:rFonts w:ascii="Calibri" w:hAnsi="Calibri"/>
-        </w:rPr>
-        <w:t xml:space="preserve"> </w:t>
+        <w:t xml:space="preserve"> el </w:t>
       </w:r>
       <w:proofErr w:type="spellStart"/>
       <w:r>
@@ -543,8 +543,13 @@
             <w:tcW w:w="2946" w:type="dxa"/>
           </w:tcPr>
           <w:p>
+            <w:proofErr w:type="spellStart"/>
             <w:r>
-              <w:t xml:space="preserve">Modelo de </w:t>
+              <w:t>Modelo</w:t>
+            </w:r>
+            <w:proofErr w:type="spellEnd"/>
+            <w:r>
+              <w:t xml:space="preserve"> de </w:t>
             </w:r>
             <w:proofErr w:type="spellStart"/>
             <w:r>
@@ -609,7 +614,13 @@
               <w:rPr>
                 <w:lang w:val="es-ES"/>
               </w:rPr>
-              <w:t>Detecta y usa GPU si está disponible</w:t>
+              <w:t>Detecta y</w:t>
+            </w:r>
+            <w:r>
+              <w:rPr>
+                <w:lang w:val="es-ES"/>
+              </w:rPr>
+              <w:t xml:space="preserve"> usa GPU si está disponible</w:t>
             </w:r>
           </w:p>
         </w:tc>
@@ -1026,7 +1037,13 @@
               <w:rPr>
                 <w:lang w:val="es-ES"/>
               </w:rPr>
-              <w:t>Serialización de datos del modelo</w:t>
+              <w:t xml:space="preserve">Serialización de </w:t>
+            </w:r>
+            <w:r>
+              <w:rPr>
+                <w:lang w:val="es-ES"/>
+              </w:rPr>
+              <w:t>datos del modelo</w:t>
             </w:r>
           </w:p>
         </w:tc>
@@ -1200,7 +1217,23 @@
           <w:color w:val="006400"/>
           <w:sz w:val="19"/>
         </w:rPr>
-        <w:t xml:space="preserve">    page_icon='🤖',</w:t>
+        <w:t xml:space="preserve">    page_icon='</w:t>
+      </w:r>
+      <w:r>
+        <w:rPr>
+          <w:rFonts w:ascii="Courier New" w:hAnsi="Courier New"/>
+          <w:color w:val="006400"/>
+          <w:sz w:val="19"/>
+        </w:rPr>
+        <w:t>🤖</w:t>
+      </w:r>
+      <w:r>
+        <w:rPr>
+          <w:rFonts w:ascii="Courier New" w:hAnsi="Courier New"/>
+          <w:color w:val="006400"/>
+          <w:sz w:val="19"/>
+        </w:rPr>
+        <w:t>',</w:t>
       </w:r>
     </w:p>
     <w:p>
@@ -1285,9 +1318,8 @@
           <w:sz w:val="28"/>
           <w:lang w:val="es-ES"/>
         </w:rPr>
-        <w:t xml:space="preserve">5.3 Función </w:t>
-      </w:r>
-      <w:proofErr w:type="spellStart"/>
+        <w:t>5</w:t>
+      </w:r>
       <w:r>
         <w:rPr>
           <w:rFonts w:ascii="Calibri" w:hAnsi="Calibri"/>
@@ -1296,9 +1328,9 @@
           <w:sz w:val="28"/>
           <w:lang w:val="es-ES"/>
         </w:rPr>
-        <w:t>load_</w:t>
-      </w:r>
-      <w:proofErr w:type="gramStart"/>
+        <w:t xml:space="preserve">.3 Función </w:t>
+      </w:r>
+      <w:proofErr w:type="spellStart"/>
       <w:r>
         <w:rPr>
           <w:rFonts w:ascii="Calibri" w:hAnsi="Calibri"/>
@@ -1307,9 +1339,9 @@
           <w:sz w:val="28"/>
           <w:lang w:val="es-ES"/>
         </w:rPr>
-        <w:t>summarizer</w:t>
-      </w:r>
-      <w:proofErr w:type="spellEnd"/>
+        <w:t>load_</w:t>
+      </w:r>
+      <w:proofErr w:type="gramStart"/>
       <w:r>
         <w:rPr>
           <w:rFonts w:ascii="Calibri" w:hAnsi="Calibri"/>
@@ -1318,9 +1350,9 @@
           <w:sz w:val="28"/>
           <w:lang w:val="es-ES"/>
         </w:rPr>
-        <w:t>(</w:t>
-      </w:r>
-      <w:proofErr w:type="gramEnd"/>
+        <w:t>summarizer</w:t>
+      </w:r>
+      <w:proofErr w:type="spellEnd"/>
       <w:r>
         <w:rPr>
           <w:rFonts w:ascii="Calibri" w:hAnsi="Calibri"/>
@@ -1329,152 +1361,9 @@
           <w:sz w:val="28"/>
           <w:lang w:val="es-ES"/>
         </w:rPr>
-        <w:t>)</w:t>
-      </w:r>
-    </w:p>
-    <w:p>
-      <w:pPr>
-        <w:spacing w:before="40" w:after="80"/>
-        <w:rPr>
-          <w:lang w:val="es-ES"/>
-        </w:rPr>
-      </w:pPr>
-      <w:r>
-        <w:rPr>
-          <w:rFonts w:ascii="Calibri" w:hAnsi="Calibri"/>
-          <w:lang w:val="es-ES"/>
-        </w:rPr>
-        <w:t>Carga el modelo de IA una sola vez y lo mantiene en memoria gracias al decorador @</w:t>
-      </w:r>
-      <w:proofErr w:type="gramStart"/>
-      <w:r>
-        <w:rPr>
-          <w:rFonts w:ascii="Calibri" w:hAnsi="Calibri"/>
-          <w:lang w:val="es-ES"/>
-        </w:rPr>
-        <w:t>st.cache</w:t>
+        <w:t>(</w:t>
       </w:r>
       <w:proofErr w:type="gramEnd"/>
-      <w:r>
-        <w:rPr>
-          <w:rFonts w:ascii="Calibri" w:hAnsi="Calibri"/>
-          <w:lang w:val="es-ES"/>
-        </w:rPr>
-        <w:t>_resource. Detecta automáticamente si hay GPU disponible para acelerar la inferencia.</w:t>
-      </w:r>
-    </w:p>
-    <w:p>
-      <w:pPr>
-        <w:shd w:val="clear" w:color="auto" w:fill="F0F0F0"/>
-        <w:spacing w:before="80" w:after="80"/>
-        <w:ind w:left="567"/>
-      </w:pPr>
-      <w:r>
-        <w:rPr>
-          <w:rFonts w:ascii="Courier New" w:hAnsi="Courier New"/>
-          <w:color w:val="006400"/>
-          <w:sz w:val="19"/>
-        </w:rPr>
-        <w:t>@</w:t>
-      </w:r>
-      <w:proofErr w:type="gramStart"/>
-      <w:r>
-        <w:rPr>
-          <w:rFonts w:ascii="Courier New" w:hAnsi="Courier New"/>
-          <w:color w:val="006400"/>
-          <w:sz w:val="19"/>
-        </w:rPr>
-        <w:t>st.cache</w:t>
-      </w:r>
-      <w:proofErr w:type="gramEnd"/>
-      <w:r>
-        <w:rPr>
-          <w:rFonts w:ascii="Courier New" w:hAnsi="Courier New"/>
-          <w:color w:val="006400"/>
-          <w:sz w:val="19"/>
-        </w:rPr>
-        <w:t>_resource</w:t>
-      </w:r>
-    </w:p>
-    <w:p>
-      <w:pPr>
-        <w:shd w:val="clear" w:color="auto" w:fill="F0F0F0"/>
-        <w:spacing w:before="80" w:after="80"/>
-        <w:ind w:left="567"/>
-      </w:pPr>
-      <w:r>
-        <w:rPr>
-          <w:rFonts w:ascii="Courier New" w:hAnsi="Courier New"/>
-          <w:color w:val="006400"/>
-          <w:sz w:val="19"/>
-        </w:rPr>
-        <w:t>def load_summarizer():</w:t>
-      </w:r>
-    </w:p>
-    <w:p>
-      <w:pPr>
-        <w:shd w:val="clear" w:color="auto" w:fill="F0F0F0"/>
-        <w:spacing w:before="80" w:after="80"/>
-        <w:ind w:left="567"/>
-      </w:pPr>
-      <w:r>
-        <w:rPr>
-          <w:rFonts w:ascii="Courier New" w:hAnsi="Courier New"/>
-          <w:color w:val="006400"/>
-          <w:sz w:val="19"/>
-        </w:rPr>
-        <w:t xml:space="preserve">    model_name = 'Narrativa/bsc_roberta2roberta_shared-spanish-finetuned-mlsum-summarization'</w:t>
-      </w:r>
-    </w:p>
-    <w:p>
-      <w:pPr>
-        <w:shd w:val="clear" w:color="auto" w:fill="F0F0F0"/>
-        <w:spacing w:before="80" w:after="80"/>
-        <w:ind w:left="567"/>
-      </w:pPr>
-      <w:r>
-        <w:rPr>
-          <w:rFonts w:ascii="Courier New" w:hAnsi="Courier New"/>
-          <w:color w:val="006400"/>
-          <w:sz w:val="19"/>
-        </w:rPr>
-        <w:t xml:space="preserve">    device = 0 if torch.cuda.is_available() else -1</w:t>
-      </w:r>
-    </w:p>
-    <w:p>
-      <w:pPr>
-        <w:shd w:val="clear" w:color="auto" w:fill="F0F0F0"/>
-        <w:spacing w:before="80" w:after="80"/>
-        <w:ind w:left="567"/>
-        <w:rPr>
-          <w:lang w:val="es-ES"/>
-        </w:rPr>
-      </w:pPr>
-      <w:r>
-        <w:rPr>
-          <w:rFonts w:ascii="Courier New" w:hAnsi="Courier New"/>
-          <w:color w:val="006400"/>
-          <w:sz w:val="19"/>
-        </w:rPr>
-        <w:t xml:space="preserve">    </w:t>
-      </w:r>
-      <w:r>
-        <w:rPr>
-          <w:rFonts w:ascii="Courier New" w:hAnsi="Courier New"/>
-          <w:color w:val="006400"/>
-          <w:sz w:val="19"/>
-          <w:lang w:val="es-ES"/>
-        </w:rPr>
-        <w:t>...</w:t>
-      </w:r>
-    </w:p>
-    <w:p>
-      <w:pPr>
-        <w:spacing w:before="160" w:after="80"/>
-        <w:rPr>
-          <w:lang w:val="es-ES"/>
-        </w:rPr>
-      </w:pPr>
       <w:r>
         <w:rPr>
           <w:rFonts w:ascii="Calibri" w:hAnsi="Calibri"/>
@@ -1483,10 +1372,152 @@
           <w:sz w:val="28"/>
           <w:lang w:val="es-ES"/>
         </w:rPr>
-        <w:t xml:space="preserve">5.4 Función </w:t>
-      </w:r>
-      <w:proofErr w:type="spellStart"/>
+        <w:t>)</w:t>
+      </w:r>
+    </w:p>
+    <w:p>
+      <w:pPr>
+        <w:spacing w:before="40" w:after="80"/>
+        <w:rPr>
+          <w:lang w:val="es-ES"/>
+        </w:rPr>
+      </w:pPr>
+      <w:r>
+        <w:rPr>
+          <w:rFonts w:ascii="Calibri" w:hAnsi="Calibri"/>
+          <w:lang w:val="es-ES"/>
+        </w:rPr>
+        <w:t>Carga el modelo de IA una sola vez y lo mantiene en memoria gracias al decorador @</w:t>
+      </w:r>
       <w:proofErr w:type="gramStart"/>
+      <w:r>
+        <w:rPr>
+          <w:rFonts w:ascii="Calibri" w:hAnsi="Calibri"/>
+          <w:lang w:val="es-ES"/>
+        </w:rPr>
+        <w:t>st.cache</w:t>
+      </w:r>
+      <w:proofErr w:type="gramEnd"/>
+      <w:r>
+        <w:rPr>
+          <w:rFonts w:ascii="Calibri" w:hAnsi="Calibri"/>
+          <w:lang w:val="es-ES"/>
+        </w:rPr>
+        <w:t>_resource. Detecta automáticamente si hay GPU disponible para acelerar la inferencia.</w:t>
+      </w:r>
+    </w:p>
+    <w:p>
+      <w:pPr>
+        <w:shd w:val="clear" w:color="auto" w:fill="F0F0F0"/>
+        <w:spacing w:before="80" w:after="80"/>
+        <w:ind w:left="567"/>
+      </w:pPr>
+      <w:r>
+        <w:rPr>
+          <w:rFonts w:ascii="Courier New" w:hAnsi="Courier New"/>
+          <w:color w:val="006400"/>
+          <w:sz w:val="19"/>
+        </w:rPr>
+        <w:t>@</w:t>
+      </w:r>
+      <w:proofErr w:type="gramStart"/>
+      <w:r>
+        <w:rPr>
+          <w:rFonts w:ascii="Courier New" w:hAnsi="Courier New"/>
+          <w:color w:val="006400"/>
+          <w:sz w:val="19"/>
+        </w:rPr>
+        <w:t>st.cache</w:t>
+      </w:r>
+      <w:proofErr w:type="gramEnd"/>
+      <w:r>
+        <w:rPr>
+          <w:rFonts w:ascii="Courier New" w:hAnsi="Courier New"/>
+          <w:color w:val="006400"/>
+          <w:sz w:val="19"/>
+        </w:rPr>
+        <w:t>_resource</w:t>
+      </w:r>
+    </w:p>
+    <w:p>
+      <w:pPr>
+        <w:shd w:val="clear" w:color="auto" w:fill="F0F0F0"/>
+        <w:spacing w:before="80" w:after="80"/>
+        <w:ind w:left="567"/>
+      </w:pPr>
+      <w:r>
+        <w:rPr>
+          <w:rFonts w:ascii="Courier New" w:hAnsi="Courier New"/>
+          <w:color w:val="006400"/>
+          <w:sz w:val="19"/>
+        </w:rPr>
+        <w:t>def load_summarizer():</w:t>
+      </w:r>
+    </w:p>
+    <w:p>
+      <w:pPr>
+        <w:shd w:val="clear" w:color="auto" w:fill="F0F0F0"/>
+        <w:spacing w:before="80" w:after="80"/>
+        <w:ind w:left="567"/>
+      </w:pPr>
+      <w:r>
+        <w:rPr>
+          <w:rFonts w:ascii="Courier New" w:hAnsi="Courier New"/>
+          <w:color w:val="006400"/>
+          <w:sz w:val="19"/>
+        </w:rPr>
+        <w:t xml:space="preserve">    model_name = 'Narrativa/bsc_roberta2roberta_shared-spanish-finetuned-mlsum-summarization'</w:t>
+      </w:r>
+    </w:p>
+    <w:p>
+      <w:pPr>
+        <w:shd w:val="clear" w:color="auto" w:fill="F0F0F0"/>
+        <w:spacing w:before="80" w:after="80"/>
+        <w:ind w:left="567"/>
+      </w:pPr>
+      <w:r>
+        <w:rPr>
+          <w:rFonts w:ascii="Courier New" w:hAnsi="Courier New"/>
+          <w:color w:val="006400"/>
+          <w:sz w:val="19"/>
+        </w:rPr>
+        <w:t xml:space="preserve">    device = 0 if torch.cuda.is_available() else -1</w:t>
+      </w:r>
+    </w:p>
+    <w:p>
+      <w:pPr>
+        <w:shd w:val="clear" w:color="auto" w:fill="F0F0F0"/>
+        <w:spacing w:before="80" w:after="80"/>
+        <w:ind w:left="567"/>
+        <w:rPr>
+          <w:lang w:val="es-ES"/>
+        </w:rPr>
+      </w:pPr>
+      <w:r>
+        <w:rPr>
+          <w:rFonts w:ascii="Courier New" w:hAnsi="Courier New"/>
+          <w:color w:val="006400"/>
+          <w:sz w:val="19"/>
+        </w:rPr>
+        <w:t xml:space="preserve">    </w:t>
+      </w:r>
+      <w:r>
+        <w:rPr>
+          <w:rFonts w:ascii="Courier New" w:hAnsi="Courier New"/>
+          <w:color w:val="006400"/>
+          <w:sz w:val="19"/>
+          <w:lang w:val="es-ES"/>
+        </w:rPr>
+        <w:t>...</w:t>
+      </w:r>
+    </w:p>
+    <w:p>
+      <w:pPr>
+        <w:spacing w:before="160" w:after="80"/>
+        <w:rPr>
+          <w:lang w:val="es-ES"/>
+        </w:rPr>
+      </w:pPr>
       <w:r>
         <w:rPr>
           <w:rFonts w:ascii="Calibri" w:hAnsi="Calibri"/>
@@ -1495,9 +1526,10 @@
           <w:sz w:val="28"/>
           <w:lang w:val="es-ES"/>
         </w:rPr>
-        <w:t>main</w:t>
-      </w:r>
-      <w:proofErr w:type="spellEnd"/>
+        <w:t xml:space="preserve">5.4 Función </w:t>
+      </w:r>
+      <w:proofErr w:type="spellStart"/>
+      <w:proofErr w:type="gramStart"/>
       <w:r>
         <w:rPr>
           <w:rFonts w:ascii="Calibri" w:hAnsi="Calibri"/>
@@ -1506,9 +1538,9 @@
           <w:sz w:val="28"/>
           <w:lang w:val="es-ES"/>
         </w:rPr>
-        <w:t>(</w:t>
-      </w:r>
-      <w:proofErr w:type="gramEnd"/>
+        <w:t>main</w:t>
+      </w:r>
+      <w:proofErr w:type="spellEnd"/>
       <w:r>
         <w:rPr>
           <w:rFonts w:ascii="Calibri" w:hAnsi="Calibri"/>
@@ -1517,6 +1549,17 @@
           <w:sz w:val="28"/>
           <w:lang w:val="es-ES"/>
         </w:rPr>
+        <w:t>(</w:t>
+      </w:r>
+      <w:proofErr w:type="gramEnd"/>
+      <w:r>
+        <w:rPr>
+          <w:rFonts w:ascii="Calibri" w:hAnsi="Calibri"/>
+          <w:b/>
+          <w:color w:val="1E5AA0"/>
+          <w:sz w:val="28"/>
+          <w:lang w:val="es-ES"/>
+        </w:rPr>
         <w:t>)</w:t>
       </w:r>
     </w:p>
@@ -1535,7 +1578,21 @@
         <w:rPr>
           <w:rFonts w:ascii="Calibri" w:hAnsi="Calibri"/>
         </w:rPr>
-        <w:t xml:space="preserve">Sus partes </w:t>
+        <w:t xml:space="preserve">Sus </w:t>
+      </w:r>
+      <w:proofErr w:type="spellStart"/>
+      <w:r>
+        <w:rPr>
+          <w:rFonts w:ascii="Calibri" w:hAnsi="Calibri"/>
+        </w:rPr>
+        <w:t>partes</w:t>
+      </w:r>
+      <w:proofErr w:type="spellEnd"/>
+      <w:r>
+        <w:rPr>
+          <w:rFonts w:ascii="Calibri" w:hAnsi="Calibri"/>
+        </w:rPr>
+        <w:t xml:space="preserve"> </w:t>
       </w:r>
       <w:proofErr w:type="spellStart"/>
       <w:r>
@@ -1565,7 +1622,14 @@
           <w:rFonts w:ascii="Calibri" w:hAnsi="Calibri"/>
           <w:lang w:val="es-ES"/>
         </w:rPr>
-        <w:t>Área de texto: donde el usuario pega el contenido a resumir.</w:t>
+        <w:t>Área de texto: donde e</w:t>
+      </w:r>
+      <w:r>
+        <w:rPr>
+          <w:rFonts w:ascii="Calibri" w:hAnsi="Calibri"/>
+          <w:lang w:val="es-ES"/>
+        </w:rPr>
+        <w:t>l usuario pega el contenido a resumir.</w:t>
       </w:r>
     </w:p>
     <w:p>
@@ -1684,7 +1748,15 @@
           <w:color w:val="006400"/>
           <w:sz w:val="19"/>
         </w:rPr>
-        <w:t xml:space="preserve">    max_length=max_len,</w:t>
+        <w:t xml:space="preserve"> </w:t>
+      </w:r>
+      <w:r>
+        <w:rPr>
+          <w:rFonts w:ascii="Courier New" w:hAnsi="Courier New"/>
+          <w:color w:val="006400"/>
+          <w:sz w:val="19"/>
+        </w:rPr>
+        <w:t xml:space="preserve">   max_length=max_len,</w:t>
       </w:r>
     </w:p>
     <w:p>
@@ -2056,7 +2128,14 @@
           <w:rFonts w:ascii="Calibri" w:hAnsi="Calibri"/>
           <w:lang w:val="es-ES"/>
         </w:rPr>
-        <w:t>Paso 1: Pegar el texto en el área de entrada.</w:t>
+        <w:t xml:space="preserve">Paso 1: Pegar el texto en </w:t>
+      </w:r>
+      <w:r>
+        <w:rPr>
+          <w:rFonts w:ascii="Calibri" w:hAnsi="Calibri"/>
+          <w:lang w:val="es-ES"/>
+        </w:rPr>
+        <w:t>el área de entrada.</w:t>
       </w:r>
     </w:p>
     <w:p>
@@ -2158,21 +2237,19 @@
           <w:lang w:val="es-ES"/>
         </w:rPr>
       </w:pPr>
-      <w:proofErr w:type="gramStart"/>
       <w:r>
         <w:rPr>
           <w:rFonts w:ascii="Calibri" w:hAnsi="Calibri"/>
           <w:lang w:val="es-ES"/>
         </w:rPr>
-        <w:t>✅  Sin</w:t>
-      </w:r>
-      <w:proofErr w:type="gramEnd"/>
+        <w:t>✅</w:t>
+      </w:r>
       <w:r>
         <w:rPr>
           <w:rFonts w:ascii="Calibri" w:hAnsi="Calibri"/>
           <w:lang w:val="es-ES"/>
         </w:rPr>
-        <w:t xml:space="preserve"> API </w:t>
+        <w:t xml:space="preserve">  Sin API </w:t>
       </w:r>
       <w:proofErr w:type="spellStart"/>
       <w:r>
@@ -2188,7 +2265,14 @@
           <w:rFonts w:ascii="Calibri" w:hAnsi="Calibri"/>
           <w:lang w:val="es-ES"/>
         </w:rPr>
-        <w:t xml:space="preserve"> ni cuentas externas requeridas.</w:t>
+        <w:t xml:space="preserve"> ni cuentas externa</w:t>
+      </w:r>
+      <w:r>
+        <w:rPr>
+          <w:rFonts w:ascii="Calibri" w:hAnsi="Calibri"/>
+          <w:lang w:val="es-ES"/>
+        </w:rPr>
+        <w:t>s requeridas.</w:t>
       </w:r>
     </w:p>
     <w:p>
@@ -2199,21 +2283,19 @@
           <w:lang w:val="es-ES"/>
         </w:rPr>
       </w:pPr>
-      <w:proofErr w:type="gramStart"/>
       <w:r>
         <w:rPr>
           <w:rFonts w:ascii="Calibri" w:hAnsi="Calibri"/>
           <w:lang w:val="es-ES"/>
         </w:rPr>
-        <w:t>✅  Sin</w:t>
-      </w:r>
-      <w:proofErr w:type="gramEnd"/>
+        <w:t>✅</w:t>
+      </w:r>
       <w:r>
         <w:rPr>
           <w:rFonts w:ascii="Calibri" w:hAnsi="Calibri"/>
           <w:lang w:val="es-ES"/>
         </w:rPr>
-        <w:t xml:space="preserve"> telemetría ni envío de datos a terceros.</w:t>
+        <w:t xml:space="preserve">  Sin telemetría ni envío de datos a terceros.</w:t>
       </w:r>
     </w:p>
     <w:p>
@@ -2224,21 +2306,19 @@
           <w:lang w:val="es-ES"/>
         </w:rPr>
       </w:pPr>
-      <w:proofErr w:type="gramStart"/>
       <w:r>
         <w:rPr>
           <w:rFonts w:ascii="Calibri" w:hAnsi="Calibri"/>
           <w:lang w:val="es-ES"/>
         </w:rPr>
-        <w:t>✅  Modelo</w:t>
-      </w:r>
-      <w:proofErr w:type="gramEnd"/>
+        <w:t>✅</w:t>
+      </w:r>
       <w:r>
         <w:rPr>
           <w:rFonts w:ascii="Calibri" w:hAnsi="Calibri"/>
           <w:lang w:val="es-ES"/>
         </w:rPr>
-        <w:t xml:space="preserve"> descargado y ejecutado localmente.</w:t>
+        <w:t xml:space="preserve">  Modelo descargado y ejecutado localmente.</w:t>
       </w:r>
     </w:p>
     <w:p>
@@ -2249,21 +2329,19 @@
           <w:lang w:val="es-ES"/>
         </w:rPr>
       </w:pPr>
-      <w:proofErr w:type="gramStart"/>
       <w:r>
         <w:rPr>
           <w:rFonts w:ascii="Calibri" w:hAnsi="Calibri"/>
           <w:lang w:val="es-ES"/>
         </w:rPr>
-        <w:t>✅  Funciona</w:t>
-      </w:r>
-      <w:proofErr w:type="gramEnd"/>
+        <w:t>✅</w:t>
+      </w:r>
       <w:r>
         <w:rPr>
           <w:rFonts w:ascii="Calibri" w:hAnsi="Calibri"/>
           <w:lang w:val="es-ES"/>
         </w:rPr>
-        <w:t xml:space="preserve"> sin internet tras la primera descarga del modelo.</w:t>
+        <w:t xml:space="preserve">  Funciona sin internet tras la primera descarga del modelo.</w:t>
       </w:r>
     </w:p>
     <w:p>
@@ -2288,7 +2366,13 @@
         <w:rPr>
           <w:rFonts w:ascii="Calibri" w:hAnsi="Calibri"/>
         </w:rPr>
-        <w:t>Narrativa/bsc_roberta2roberta_shared-spanish-finetuned-mlsum-summarization</w:t>
+        <w:t>Narrativa/bsc_roberta2roberta_shared-spanish-finetuned-mlsum-</w:t>
+      </w:r>
+      <w:r>
+        <w:rPr>
+          <w:rFonts w:ascii="Calibri" w:hAnsi="Calibri"/>
+        </w:rPr>
+        <w:t>summarization</w:t>
       </w:r>
     </w:p>
     <w:tbl>
@@ -2516,7 +2600,13 @@
         <w:rPr>
           <w:lang w:val="es-ES"/>
         </w:rPr>
-        <w:t>Archivos de texto plano (.</w:t>
+        <w:t xml:space="preserve">Archivos de texto plano </w:t>
+      </w:r>
+      <w:r>
+        <w:rPr>
+          <w:lang w:val="es-ES"/>
+        </w:rPr>
+        <w:t>(.</w:t>
       </w:r>
       <w:proofErr w:type="spellStart"/>
       <w:r>
@@ -2592,7 +2682,13 @@
         <w:rPr>
           <w:lang w:val="es-ES"/>
         </w:rPr>
-        <w:t>), el texto de estos documentos se extrae de forma automática para su procesamiento, manteniéndose oculto todo el proceso interno para el usuario final.</w:t>
+        <w:t>), el texto de estos documentos se extrae de forma automática para su procesamiento, manteniéndose oculto todo el proceso interno para el usuari</w:t>
+      </w:r>
+      <w:r>
+        <w:rPr>
+          <w:lang w:val="es-ES"/>
+        </w:rPr>
+        <w:t>o final.</w:t>
       </w:r>
     </w:p>
     <w:p>
@@ -2602,30 +2698,25 @@
           <w:lang w:val="es-ES"/>
         </w:rPr>
       </w:pPr>
-      <w:r>
-        <w:rPr>
-          <w:lang w:val="es-ES"/>
-        </w:rPr>
-        <w:t>Procesamiento de Textos Largos (</w:t>
-      </w:r>
       <w:proofErr w:type="spellStart"/>
       <w:r>
         <w:rPr>
           <w:lang w:val="es-ES"/>
         </w:rPr>
-        <w:t>Chunking</w:t>
+        <w:t>Limitacion</w:t>
       </w:r>
       <w:proofErr w:type="spellEnd"/>
       <w:r>
         <w:rPr>
           <w:lang w:val="es-ES"/>
         </w:rPr>
-        <w:t>)</w:t>
+        <w:t xml:space="preserve"> de tamaño de textos</w:t>
       </w:r>
     </w:p>
     <w:p>
       <w:pPr>
         <w:rPr>
+          <w:u w:val="single"/>
           <w:lang w:val="es-ES"/>
         </w:rPr>
       </w:pPr>
@@ -2661,61 +2752,16 @@
         <w:rPr>
           <w:lang w:val="es-ES"/>
         </w:rPr>
-        <w:t xml:space="preserve"> que tiene un límite de entrada de 514 tokens), se ha implementado un mecanismo de fragmentación o "</w:t>
-      </w:r>
-      <w:proofErr w:type="spellStart"/>
-      <w:r>
-        <w:rPr>
-          <w:lang w:val="es-ES"/>
-        </w:rPr>
-        <w:t>chunking</w:t>
-      </w:r>
-      <w:proofErr w:type="spellEnd"/>
-      <w:r>
-        <w:rPr>
-          <w:lang w:val="es-ES"/>
-        </w:rPr>
-        <w:t>".</w:t>
-      </w:r>
-    </w:p>
-    <w:p>
-      <w:pPr>
-        <w:rPr>
-          <w:lang w:val="es-ES"/>
-        </w:rPr>
-      </w:pPr>
-      <w:r>
-        <w:rPr>
-          <w:lang w:val="es-ES"/>
-        </w:rPr>
-        <w:t>El texto de entrada se divide de manera inteligente en fragmentos de aproximadamente 1800 caracteres, respetando en la medida de lo posible los límites de los párrafos y las frases para evitar cortes que afecten a la comprensión del texto.</w:t>
-      </w:r>
-    </w:p>
-    <w:p>
-      <w:pPr>
-        <w:rPr>
-          <w:lang w:val="es-ES"/>
-        </w:rPr>
-      </w:pPr>
-      <w:r>
-        <w:rPr>
-          <w:lang w:val="es-ES"/>
-        </w:rPr>
-        <w:t>Cada uno de estos fragmentos es procesado individualmente, durante lo cual la interfaz muestra una barra de progreso que indica el avance. Al finalizar, los diferentes resúmenes generados se combinan y se exponen como un único resumen final cohesionado y unificado.</w:t>
-      </w:r>
-    </w:p>
-    <w:p>
-      <w:pPr>
-        <w:rPr>
-          <w:lang w:val="es-ES"/>
-        </w:rPr>
-      </w:pPr>
-      <w:r>
-        <w:rPr>
-          <w:lang w:val="es-ES"/>
-        </w:rPr>
-        <w:t>Todo este mecanismo previene bloqueos por exceso de longitud (Errores de formato/tamaño del tensor) y permite resumir documentos PDF o Word enteros sin importar su extensión.</w:t>
-      </w:r>
+        <w:t xml:space="preserve"> que tiene un límite de entrada de 514 tokens), se ha</w:t>
+      </w:r>
+      <w:r>
+        <w:rPr>
+          <w:lang w:val="es-ES"/>
+        </w:rPr>
+        <w:t xml:space="preserve"> limitado la entrada de texto a 1500 caracteres, tanto por entrada de usuario o de archivo.</w:t>
+      </w:r>
+      <w:bookmarkStart w:id="0" w:name="_GoBack"/>
+      <w:bookmarkEnd w:id="0"/>
     </w:p>
     <w:sectPr>
       <w:pgSz w:w="12240" w:h="15840"/>
@@ -2728,7 +2774,7 @@
 </file>
 
 <file path=word/numbering.xml><?xml version="1.0" encoding="utf-8"?>
-<w:numbering xmlns:wpc="http://schemas.microsoft.com/office/word/2010/wordprocessingCanvas" xmlns:cx="http://schemas.microsoft.com/office/drawing/2014/chartex" xmlns:cx1="http://schemas.microsoft.com/office/drawing/2015/9/8/chartex" xmlns:cx2="http://schemas.microsoft.com/office/drawing/2015/10/21/chartex" xmlns:cx3="http://schemas.microsoft.com/office/drawing/2016/5/9/chartex" xmlns:cx4="http://schemas.microsoft.com/office/drawing/2016/5/10/chartex" xmlns:cx5="http://schemas.microsoft.com/office/drawing/2016/5/11/chartex" xmlns:cx6="http://schemas.microsoft.com/office/drawing/2016/5/12/chartex" xmlns:cx7="http://schemas.microsoft.com/office/drawing/2016/5/13/chartex" xmlns:cx8="http://schemas.microsoft.com/office/drawing/2016/5/14/chartex" xmlns:mc="http://schemas.openxmlformats.org/markup-compatibility/2006" xmlns:aink="http://schemas.microsoft.com/office/drawing/2016/ink" xmlns:am3d="http://schemas.microsoft.com/office/drawing/2017/model3d" xmlns:o="urn:schemas-microsoft-com:office:office" xmlns:oel="http://schemas.microsoft.com/office/2019/extlst" xmlns:r="http://schemas.openxmlformats.org/officeDocument/2006/relationships" xmlns:m="http://schemas.openxmlformats.org/officeDocument/2006/math" xmlns:v="urn:schemas-microsoft-com:vml" xmlns:wp14="http://schemas.microsoft.com/office/word/2010/wordprocessingDrawing" xmlns:wp="http://schemas.openxmlformats.org/drawingml/2006/wordprocessingDrawing" xmlns:w10="urn:schemas-microsoft-com:office:word" xmlns:w="http://schemas.openxmlformats.org/wordprocessingml/2006/main" xmlns:w14="http://schemas.microsoft.com/office/word/2010/wordml" xmlns:w15="http://schemas.microsoft.com/office/word/2012/wordml" xmlns:w16cex="http://schemas.microsoft.com/office/word/2018/wordml/cex" xmlns:w16cid="http://schemas.microsoft.com/office/word/2016/wordml/cid" xmlns:w16="http://schemas.microsoft.com/office/word/2018/wordml" xmlns:w16du="http://schemas.microsoft.com/office/word/2023/wordml/word16du" xmlns:w16sdtdh="http://schemas.microsoft.com/office/word/2020/wordml/sdtdatahash" xmlns:w16sdtfl="http://schemas.microsoft.com/office/word/2024/wordml/sdtformatlock" xmlns:w16se="http://schemas.microsoft.com/office/word/2015/wordml/symex" xmlns:wpg="http://schemas.microsoft.com/office/word/2010/wordprocessingGroup" xmlns:wpi="http://schemas.microsoft.com/office/word/2010/wordprocessingInk" xmlns:wne="http://schemas.microsoft.com/office/word/2006/wordml" xmlns:wps="http://schemas.microsoft.com/office/word/2010/wordprocessingShape" mc:Ignorable="w14 w15 w16se w16cid w16 w16cex w16sdtdh w16sdtfl w16du wp14">
+<w:numbering xmlns:wpc="http://schemas.microsoft.com/office/word/2010/wordprocessingCanvas" xmlns:cx="http://schemas.microsoft.com/office/drawing/2014/chartex" xmlns:cx1="http://schemas.microsoft.com/office/drawing/2015/9/8/chartex" xmlns:cx2="http://schemas.microsoft.com/office/drawing/2015/10/21/chartex" xmlns:cx3="http://schemas.microsoft.com/office/drawing/2016/5/9/chartex" xmlns:cx4="http://schemas.microsoft.com/office/drawing/2016/5/10/chartex" xmlns:cx5="http://schemas.microsoft.com/office/drawing/2016/5/11/chartex" xmlns:cx6="http://schemas.microsoft.com/office/drawing/2016/5/12/chartex" xmlns:cx7="http://schemas.microsoft.com/office/drawing/2016/5/13/chartex" xmlns:cx8="http://schemas.microsoft.com/office/drawing/2016/5/14/chartex" xmlns:mc="http://schemas.openxmlformats.org/markup-compatibility/2006" xmlns:aink="http://schemas.microsoft.com/office/drawing/2016/ink" xmlns:am3d="http://schemas.microsoft.com/office/drawing/2017/model3d" xmlns:o="urn:schemas-microsoft-com:office:office" xmlns:r="http://schemas.openxmlformats.org/officeDocument/2006/relationships" xmlns:m="http://schemas.openxmlformats.org/officeDocument/2006/math" xmlns:v="urn:schemas-microsoft-com:vml" xmlns:wp14="http://schemas.microsoft.com/office/word/2010/wordprocessingDrawing" xmlns:wp="http://schemas.openxmlformats.org/drawingml/2006/wordprocessingDrawing" xmlns:w10="urn:schemas-microsoft-com:office:word" xmlns:w="http://schemas.openxmlformats.org/wordprocessingml/2006/main" xmlns:w14="http://schemas.microsoft.com/office/word/2010/wordml" xmlns:w15="http://schemas.microsoft.com/office/word/2012/wordml" xmlns:w16cid="http://schemas.microsoft.com/office/word/2016/wordml/cid" xmlns:w16se="http://schemas.microsoft.com/office/word/2015/wordml/symex" xmlns:wpg="http://schemas.microsoft.com/office/word/2010/wordprocessingGroup" xmlns:wpi="http://schemas.microsoft.com/office/word/2010/wordprocessingInk" xmlns:wne="http://schemas.microsoft.com/office/word/2006/wordml" xmlns:wps="http://schemas.microsoft.com/office/word/2010/wordprocessingShape" mc:Ignorable="w14 w15 w16se w16cid wp14">
   <w:abstractNum w:abstractNumId="0" w15:restartNumberingAfterBreak="0">
     <w:nsid w:val="FFFFFF7C"/>
     <w:multiLevelType w:val="singleLevel"/>
@@ -2900,38 +2946,38 @@
       </w:rPr>
     </w:lvl>
   </w:abstractNum>
-  <w:num w:numId="1" w16cid:durableId="990254918">
+  <w:num w:numId="1">
     <w:abstractNumId w:val="8"/>
   </w:num>
-  <w:num w:numId="2" w16cid:durableId="1326124757">
+  <w:num w:numId="2">
     <w:abstractNumId w:val="6"/>
   </w:num>
-  <w:num w:numId="3" w16cid:durableId="1812356596">
+  <w:num w:numId="3">
     <w:abstractNumId w:val="5"/>
   </w:num>
-  <w:num w:numId="4" w16cid:durableId="1537742347">
+  <w:num w:numId="4">
     <w:abstractNumId w:val="4"/>
   </w:num>
-  <w:num w:numId="5" w16cid:durableId="1933079152">
+  <w:num w:numId="5">
     <w:abstractNumId w:val="7"/>
   </w:num>
-  <w:num w:numId="6" w16cid:durableId="875119259">
+  <w:num w:numId="6">
     <w:abstractNumId w:val="3"/>
   </w:num>
-  <w:num w:numId="7" w16cid:durableId="1517423458">
+  <w:num w:numId="7">
     <w:abstractNumId w:val="2"/>
   </w:num>
-  <w:num w:numId="8" w16cid:durableId="2102557049">
+  <w:num w:numId="8">
     <w:abstractNumId w:val="1"/>
   </w:num>
-  <w:num w:numId="9" w16cid:durableId="1180850070">
+  <w:num w:numId="9">
     <w:abstractNumId w:val="0"/>
   </w:num>
 </w:numbering>
 </file>
 
 <file path=word/styles.xml><?xml version="1.0" encoding="utf-8"?>
-<w:styles xmlns:mc="http://schemas.openxmlformats.org/markup-compatibility/2006" xmlns:r="http://schemas.openxmlformats.org/officeDocument/2006/relationships" xmlns:w="http://schemas.openxmlformats.org/wordprocessingml/2006/main" xmlns:w14="http://schemas.microsoft.com/office/word/2010/wordml" xmlns:w15="http://schemas.microsoft.com/office/word/2012/wordml" xmlns:w16cex="http://schemas.microsoft.com/office/word/2018/wordml/cex" xmlns:w16cid="http://schemas.microsoft.com/office/word/2016/wordml/cid" xmlns:w16="http://schemas.microsoft.com/office/word/2018/wordml" xmlns:w16du="http://schemas.microsoft.com/office/word/2023/wordml/word16du" xmlns:w16sdtdh="http://schemas.microsoft.com/office/word/2020/wordml/sdtdatahash" xmlns:w16sdtfl="http://schemas.microsoft.com/office/word/2024/wordml/sdtformatlock" xmlns:w16se="http://schemas.microsoft.com/office/word/2015/wordml/symex" mc:Ignorable="w14 w15 w16se w16cid w16 w16cex w16sdtdh w16sdtfl w16du">
+<w:styles xmlns:mc="http://schemas.openxmlformats.org/markup-compatibility/2006" xmlns:r="http://schemas.openxmlformats.org/officeDocument/2006/relationships" xmlns:w="http://schemas.openxmlformats.org/wordprocessingml/2006/main" xmlns:w14="http://schemas.microsoft.com/office/word/2010/wordml" xmlns:w15="http://schemas.microsoft.com/office/word/2012/wordml" xmlns:w16cid="http://schemas.microsoft.com/office/word/2016/wordml/cid" xmlns:w16se="http://schemas.microsoft.com/office/word/2015/wordml/symex" mc:Ignorable="w14 w15 w16se w16cid">
   <w:docDefaults>
     <w:rPrDefault>
       <w:rPr>
@@ -2947,7 +2993,7 @@
       </w:pPr>
     </w:pPrDefault>
   </w:docDefaults>
-  <w:latentStyles w:defLockedState="0" w:defUIPriority="99" w:defSemiHidden="0" w:defUnhideWhenUsed="0" w:defQFormat="0" w:count="376">
+  <w:latentStyles w:defLockedState="0" w:defUIPriority="99" w:defSemiHidden="0" w:defUnhideWhenUsed="0" w:defQFormat="0" w:count="375">
     <w:lsdException w:name="Normal" w:uiPriority="0" w:qFormat="1"/>
     <w:lsdException w:name="heading 1" w:uiPriority="9" w:qFormat="1"/>
     <w:lsdException w:name="heading 2" w:semiHidden="1" w:uiPriority="9" w:unhideWhenUsed="1" w:qFormat="1"/>
@@ -3314,7 +3360,6 @@
     <w:lsdException w:name="Smart Hyperlink" w:semiHidden="1" w:unhideWhenUsed="1"/>
     <w:lsdException w:name="Hashtag" w:semiHidden="1" w:unhideWhenUsed="1"/>
     <w:lsdException w:name="Unresolved Mention" w:semiHidden="1" w:unhideWhenUsed="1"/>
-    <w:lsdException w:name="Smart Link" w:semiHidden="1" w:unhideWhenUsed="1"/>
   </w:latentStyles>
   <w:style w:type="paragraph" w:default="1" w:styleId="Normal">
     <w:name w:val="Normal"/>
@@ -4118,7 +4163,7 @@
       <w:szCs w:val="18"/>
     </w:rPr>
   </w:style>
-  <w:style w:type="character" w:styleId="Fuerte">
+  <w:style w:type="character" w:styleId="Textoennegrita">
     <w:name w:val="Strong"/>
     <w:basedOn w:val="Fuentedeprrafopredeter"/>
     <w:uiPriority w:val="22"/>
@@ -14638,7 +14683,7 @@
 </file>
 
 <file path=customXml/itemProps1.xml><?xml version="1.0" encoding="utf-8"?>
-<ds:datastoreItem xmlns:ds="http://schemas.openxmlformats.org/officeDocument/2006/customXml" ds:itemID="{EF278816-EC6F-A645-907D-7F25AECB1D4A}">
+<ds:datastoreItem xmlns:ds="http://schemas.openxmlformats.org/officeDocument/2006/customXml" ds:itemID="{B533A468-0F9D-4605-8A7B-D840D23C25A8}">
   <ds:schemaRefs>
     <ds:schemaRef ds:uri="http://schemas.openxmlformats.org/officeDocument/2006/bibliography"/>
   </ds:schemaRefs>

</xml_diff>